<commit_message>
Agregando proyecto ciclo 3
</commit_message>
<xml_diff>
--- a/OneDrive/Escritorio/repositorio Github/PROYECTO DOPO CICLO 2 AVILA BERNAL/PROYECTO-CICLO2- AVILA-BERNAL.docx
+++ b/OneDrive/Escritorio/repositorio Github/PROYECTO DOPO CICLO 2 AVILA BERNAL/PROYECTO-CICLO2- AVILA-BERNAL.docx
@@ -559,6 +559,7 @@
       </w:pPr>
       <w:r>
         <w:rPr>
+          <w:noProof/>
           <w:lang w:val="es-MX"/>
         </w:rPr>
         <w:drawing>
@@ -690,6 +691,7 @@
           <w:color w:val="375623"/>
           <w:lang w:val="es-MX"/>
         </w:rPr>
+        <w:lastRenderedPageBreak/>
         <w:t xml:space="preserve"> Código corregido:</w:t>
       </w:r>
     </w:p>
@@ -702,6 +704,7 @@
       </w:pPr>
       <w:r>
         <w:rPr>
+          <w:noProof/>
           <w:lang w:val="es-MX"/>
         </w:rPr>
         <w:drawing>
@@ -1145,6 +1148,7 @@
       </w:pPr>
       <w:r>
         <w:rPr>
+          <w:noProof/>
           <w:lang w:val="es-MX"/>
         </w:rPr>
         <w:drawing>
@@ -1291,8 +1295,10 @@
       </w:pPr>
       <w:r>
         <w:rPr>
-          <w:lang w:val="es-MX"/>
-        </w:rPr>
+          <w:noProof/>
+          <w:lang w:val="es-MX"/>
+        </w:rPr>
+        <w:lastRenderedPageBreak/>
         <w:drawing>
           <wp:inline distT="0" distB="0" distL="0" distR="0" wp14:anchorId="43A8CA14" wp14:editId="3301B25A">
             <wp:extent cx="5943600" cy="1651635"/>
@@ -1489,6 +1495,9 @@
         <w:spacing w:after="80"/>
       </w:pPr>
       <w:r>
+        <w:rPr>
+          <w:noProof/>
+        </w:rPr>
         <w:drawing>
           <wp:inline distT="0" distB="0" distL="0" distR="0" wp14:anchorId="05F07E21" wp14:editId="76797319">
             <wp:extent cx="5943600" cy="5853430"/>
@@ -1558,6 +1567,7 @@
             <w14:round/>
           </w14:textOutline>
         </w:rPr>
+        <w:lastRenderedPageBreak/>
         <w:t xml:space="preserve"> Código </w:t>
       </w:r>
       <w:proofErr w:type="spellStart"/>
@@ -1661,6 +1671,7 @@
       </w:pPr>
       <w:r>
         <w:rPr>
+          <w:noProof/>
           <w:lang w:val="es-MX"/>
         </w:rPr>
         <w:drawing>
@@ -1835,6 +1846,7 @@
       </w:pPr>
       <w:r>
         <w:rPr>
+          <w:noProof/>
           <w:lang w:val="es-MX"/>
         </w:rPr>
         <w:drawing>
@@ -1929,8 +1941,10 @@
       </w:pPr>
       <w:r>
         <w:rPr>
-          <w:lang w:val="es-MX"/>
-        </w:rPr>
+          <w:noProof/>
+          <w:lang w:val="es-MX"/>
+        </w:rPr>
+        <w:lastRenderedPageBreak/>
         <w:drawing>
           <wp:inline distT="0" distB="0" distL="0" distR="0" wp14:anchorId="721A6306" wp14:editId="36722353">
             <wp:extent cx="5943600" cy="2065020"/>
@@ -2347,6 +2361,7 @@
       </w:pPr>
       <w:r>
         <w:rPr>
+          <w:noProof/>
           <w:lang w:val="es-MX"/>
         </w:rPr>
         <w:drawing>
@@ -2600,6 +2615,7 @@
       </w:pPr>
       <w:r>
         <w:rPr>
+          <w:noProof/>
           <w:lang w:val="es-MX"/>
         </w:rPr>
         <w:drawing>
@@ -2811,6 +2827,10 @@
         <w:spacing w:after="80"/>
       </w:pPr>
       <w:r>
+        <w:rPr>
+          <w:noProof/>
+        </w:rPr>
+        <w:lastRenderedPageBreak/>
         <w:drawing>
           <wp:inline distT="0" distB="0" distL="0" distR="0" wp14:anchorId="71B7EC2D" wp14:editId="71954E95">
             <wp:extent cx="5943600" cy="6313805"/>
@@ -2861,165 +2881,90 @@
           <w:color w:val="000000" w:themeColor="text1"/>
           <w:sz w:val="22"/>
           <w:szCs w:val="22"/>
-          <w14:shadow w14:blurRad="38100" w14:dist="19050" w14:dir="2700000" w14:sx="100000" w14:sy="100000" w14:kx="0" w14:ky="0" w14:algn="tl">
-            <w14:schemeClr w14:val="dk1">
-              <w14:alpha w14:val="60000"/>
-            </w14:schemeClr>
-          </w14:shadow>
-          <w14:textOutline w14:w="0" w14:cap="flat" w14:cmpd="sng" w14:algn="ctr">
-            <w14:noFill/>
-            <w14:prstDash w14:val="solid"/>
-            <w14:round/>
-          </w14:textOutline>
-        </w:rPr>
-      </w:pPr>
-      <w:proofErr w:type="gramStart"/>
+          <w:lang w:val="es-MX"/>
+          <w14:shadow w14:blurRad="38100" w14:dist="19050" w14:dir="2700000" w14:sx="100000" w14:sy="100000" w14:kx="0" w14:ky="0" w14:algn="tl">
+            <w14:schemeClr w14:val="dk1">
+              <w14:alpha w14:val="60000"/>
+            </w14:schemeClr>
+          </w14:shadow>
+          <w14:textOutline w14:w="0" w14:cap="flat" w14:cmpd="sng" w14:algn="ctr">
+            <w14:noFill/>
+            <w14:prstDash w14:val="solid"/>
+            <w14:round/>
+          </w14:textOutline>
+        </w:rPr>
+      </w:pPr>
+      <w:proofErr w:type="spellStart"/>
       <w:r>
         <w:rPr>
           <w:bCs/>
           <w:color w:val="000000" w:themeColor="text1"/>
           <w:sz w:val="22"/>
           <w:szCs w:val="22"/>
-          <w14:shadow w14:blurRad="38100" w14:dist="19050" w14:dir="2700000" w14:sx="100000" w14:sy="100000" w14:kx="0" w14:ky="0" w14:algn="tl">
-            <w14:schemeClr w14:val="dk1">
-              <w14:alpha w14:val="60000"/>
-            </w14:schemeClr>
-          </w14:shadow>
-          <w14:textOutline w14:w="0" w14:cap="flat" w14:cmpd="sng" w14:algn="ctr">
-            <w14:noFill/>
-            <w14:prstDash w14:val="solid"/>
-            <w14:round/>
-          </w14:textOutline>
-        </w:rPr>
-        <w:t>cover(</w:t>
-      </w:r>
-      <w:proofErr w:type="gramEnd"/>
+          <w:lang w:val="es-MX"/>
+          <w14:shadow w14:blurRad="38100" w14:dist="19050" w14:dir="2700000" w14:sx="100000" w14:sy="100000" w14:kx="0" w14:ky="0" w14:algn="tl">
+            <w14:schemeClr w14:val="dk1">
+              <w14:alpha w14:val="60000"/>
+            </w14:schemeClr>
+          </w14:shadow>
+          <w14:textOutline w14:w="0" w14:cap="flat" w14:cmpd="sng" w14:algn="ctr">
+            <w14:noFill/>
+            <w14:prstDash w14:val="solid"/>
+            <w14:round/>
+          </w14:textOutline>
+        </w:rPr>
+        <w:t>cover</w:t>
+      </w:r>
+      <w:proofErr w:type="spellEnd"/>
       <w:r>
         <w:rPr>
           <w:bCs/>
           <w:color w:val="000000" w:themeColor="text1"/>
           <w:sz w:val="22"/>
           <w:szCs w:val="22"/>
-          <w14:shadow w14:blurRad="38100" w14:dist="19050" w14:dir="2700000" w14:sx="100000" w14:sy="100000" w14:kx="0" w14:ky="0" w14:algn="tl">
-            <w14:schemeClr w14:val="dk1">
-              <w14:alpha w14:val="60000"/>
-            </w14:schemeClr>
-          </w14:shadow>
-          <w14:textOutline w14:w="0" w14:cap="flat" w14:cmpd="sng" w14:algn="ctr">
-            <w14:noFill/>
-            <w14:prstDash w14:val="solid"/>
-            <w14:round/>
-          </w14:textOutline>
-        </w:rPr>
-        <w:t xml:space="preserve">) — Tapar </w:t>
-      </w:r>
-      <w:proofErr w:type="spellStart"/>
-      <w:r>
+          <w:lang w:val="es-MX"/>
+          <w14:shadow w14:blurRad="38100" w14:dist="19050" w14:dir="2700000" w14:sx="100000" w14:sy="100000" w14:kx="0" w14:ky="0" w14:algn="tl">
+            <w14:schemeClr w14:val="dk1">
+              <w14:alpha w14:val="60000"/>
+            </w14:schemeClr>
+          </w14:shadow>
+          <w14:textOutline w14:w="0" w14:cap="flat" w14:cmpd="sng" w14:algn="ctr">
+            <w14:noFill/>
+            <w14:prstDash w14:val="solid"/>
+            <w14:round/>
+          </w14:textOutline>
+        </w:rPr>
+        <w:t>() — Tapar tazas (Requisito 12)</w:t>
+      </w:r>
+    </w:p>
+    <w:p>
+      <w:pPr>
+        <w:spacing w:before="160" w:after="80"/>
         <w:rPr>
           <w:bCs/>
           <w:color w:val="000000" w:themeColor="text1"/>
           <w:sz w:val="22"/>
           <w:szCs w:val="22"/>
-          <w14:shadow w14:blurRad="38100" w14:dist="19050" w14:dir="2700000" w14:sx="100000" w14:sy="100000" w14:kx="0" w14:ky="0" w14:algn="tl">
-            <w14:schemeClr w14:val="dk1">
-              <w14:alpha w14:val="60000"/>
-            </w14:schemeClr>
-          </w14:shadow>
-          <w14:textOutline w14:w="0" w14:cap="flat" w14:cmpd="sng" w14:algn="ctr">
-            <w14:noFill/>
-            <w14:prstDash w14:val="solid"/>
-            <w14:round/>
-          </w14:textOutline>
-        </w:rPr>
-        <w:t>tazas</w:t>
-      </w:r>
-      <w:proofErr w:type="spellEnd"/>
-      <w:r>
-        <w:rPr>
-          <w:bCs/>
-          <w:color w:val="000000" w:themeColor="text1"/>
-          <w:sz w:val="22"/>
-          <w:szCs w:val="22"/>
-          <w14:shadow w14:blurRad="38100" w14:dist="19050" w14:dir="2700000" w14:sx="100000" w14:sy="100000" w14:kx="0" w14:ky="0" w14:algn="tl">
-            <w14:schemeClr w14:val="dk1">
-              <w14:alpha w14:val="60000"/>
-            </w14:schemeClr>
-          </w14:shadow>
-          <w14:textOutline w14:w="0" w14:cap="flat" w14:cmpd="sng" w14:algn="ctr">
-            <w14:noFill/>
-            <w14:prstDash w14:val="solid"/>
-            <w14:round/>
-          </w14:textOutline>
-        </w:rPr>
-        <w:t xml:space="preserve"> (</w:t>
-      </w:r>
-      <w:proofErr w:type="spellStart"/>
-      <w:r>
-        <w:rPr>
-          <w:bCs/>
-          <w:color w:val="000000" w:themeColor="text1"/>
-          <w:sz w:val="22"/>
-          <w:szCs w:val="22"/>
-          <w14:shadow w14:blurRad="38100" w14:dist="19050" w14:dir="2700000" w14:sx="100000" w14:sy="100000" w14:kx="0" w14:ky="0" w14:algn="tl">
-            <w14:schemeClr w14:val="dk1">
-              <w14:alpha w14:val="60000"/>
-            </w14:schemeClr>
-          </w14:shadow>
-          <w14:textOutline w14:w="0" w14:cap="flat" w14:cmpd="sng" w14:algn="ctr">
-            <w14:noFill/>
-            <w14:prstDash w14:val="solid"/>
-            <w14:round/>
-          </w14:textOutline>
-        </w:rPr>
-        <w:t>Requisito</w:t>
-      </w:r>
-      <w:proofErr w:type="spellEnd"/>
-      <w:r>
-        <w:rPr>
-          <w:bCs/>
-          <w:color w:val="000000" w:themeColor="text1"/>
-          <w:sz w:val="22"/>
-          <w:szCs w:val="22"/>
-          <w14:shadow w14:blurRad="38100" w14:dist="19050" w14:dir="2700000" w14:sx="100000" w14:sy="100000" w14:kx="0" w14:ky="0" w14:algn="tl">
-            <w14:schemeClr w14:val="dk1">
-              <w14:alpha w14:val="60000"/>
-            </w14:schemeClr>
-          </w14:shadow>
-          <w14:textOutline w14:w="0" w14:cap="flat" w14:cmpd="sng" w14:algn="ctr">
-            <w14:noFill/>
-            <w14:prstDash w14:val="solid"/>
-            <w14:round/>
-          </w14:textOutline>
-        </w:rPr>
-        <w:t xml:space="preserve"> 12)</w:t>
-      </w:r>
+          <w:lang w:val="es-MX"/>
+          <w14:shadow w14:blurRad="38100" w14:dist="19050" w14:dir="2700000" w14:sx="100000" w14:sy="100000" w14:kx="0" w14:ky="0" w14:algn="tl">
+            <w14:schemeClr w14:val="dk1">
+              <w14:alpha w14:val="60000"/>
+            </w14:schemeClr>
+          </w14:shadow>
+          <w14:textOutline w14:w="0" w14:cap="flat" w14:cmpd="sng" w14:algn="ctr">
+            <w14:noFill/>
+            <w14:prstDash w14:val="solid"/>
+            <w14:round/>
+          </w14:textOutline>
+        </w:rPr>
+      </w:pPr>
     </w:p>
     <w:p>
       <w:pPr>
         <w:spacing w:before="160" w:after="80"/>
         <w:rPr>
-          <w:bCs/>
-          <w:color w:val="000000" w:themeColor="text1"/>
-          <w:sz w:val="22"/>
-          <w:szCs w:val="22"/>
-          <w14:shadow w14:blurRad="38100" w14:dist="19050" w14:dir="2700000" w14:sx="100000" w14:sy="100000" w14:kx="0" w14:ky="0" w14:algn="tl">
-            <w14:schemeClr w14:val="dk1">
-              <w14:alpha w14:val="60000"/>
-            </w14:schemeClr>
-          </w14:shadow>
-          <w14:textOutline w14:w="0" w14:cap="flat" w14:cmpd="sng" w14:algn="ctr">
-            <w14:noFill/>
-            <w14:prstDash w14:val="solid"/>
-            <w14:round/>
-          </w14:textOutline>
-        </w:rPr>
-      </w:pPr>
-    </w:p>
-    <w:p>
-      <w:pPr>
-        <w:spacing w:before="160" w:after="80"/>
-        <w:rPr>
-          <w:color w:val="000000" w:themeColor="text1"/>
+          <w:color w:val="000000" w:themeColor="text1"/>
+          <w:lang w:val="es-MX"/>
           <w14:shadow w14:blurRad="38100" w14:dist="19050" w14:dir="2700000" w14:sx="100000" w14:sy="100000" w14:kx="0" w14:ky="0" w14:algn="tl">
             <w14:schemeClr w14:val="dk1">
               <w14:alpha w14:val="60000"/>
@@ -3096,6 +3041,7 @@
       </w:pPr>
       <w:r>
         <w:rPr>
+          <w:noProof/>
           <w:lang w:val="es-MX"/>
         </w:rPr>
         <w:drawing>
@@ -3154,7 +3100,6 @@
         </w:rPr>
       </w:pPr>
       <w:proofErr w:type="spellStart"/>
-      <w:proofErr w:type="gramStart"/>
       <w:r>
         <w:rPr>
           <w:bCs/>
@@ -3194,28 +3139,7 @@
             <w14:round/>
           </w14:textOutline>
         </w:rPr>
-        <w:t>(</w:t>
-      </w:r>
-      <w:proofErr w:type="gramEnd"/>
-      <w:r>
-        <w:rPr>
-          <w:bCs/>
-          <w:color w:val="000000" w:themeColor="text1"/>
-          <w:sz w:val="22"/>
-          <w:szCs w:val="22"/>
-          <w:lang w:val="es-MX"/>
-          <w14:shadow w14:blurRad="38100" w14:dist="19050" w14:dir="2700000" w14:sx="100000" w14:sy="100000" w14:kx="0" w14:ky="0" w14:algn="tl">
-            <w14:schemeClr w14:val="dk1">
-              <w14:alpha w14:val="60000"/>
-            </w14:schemeClr>
-          </w14:shadow>
-          <w14:textOutline w14:w="0" w14:cap="flat" w14:cmpd="sng" w14:algn="ctr">
-            <w14:noFill/>
-            <w14:prstDash w14:val="solid"/>
-            <w14:round/>
-          </w14:textOutline>
-        </w:rPr>
-        <w:t>) — Consultar intercambio que reduce altura (Requisito 13)</w:t>
+        <w:t>() — Consultar intercambio que reduce altura (Requisito 13)</w:t>
       </w:r>
     </w:p>
     <w:p>
@@ -3277,8 +3201,10 @@
       </w:pPr>
       <w:r>
         <w:rPr>
-          <w:lang w:val="es-MX"/>
-        </w:rPr>
+          <w:noProof/>
+          <w:lang w:val="es-MX"/>
+        </w:rPr>
+        <w:lastRenderedPageBreak/>
         <w:drawing>
           <wp:inline distT="0" distB="0" distL="0" distR="0" wp14:anchorId="3E0349B6" wp14:editId="0D5FBA9B">
             <wp:extent cx="5943600" cy="6301740"/>
@@ -3338,7 +3264,6 @@
         </w:rPr>
       </w:pPr>
       <w:proofErr w:type="spellStart"/>
-      <w:proofErr w:type="gramStart"/>
       <w:r>
         <w:rPr>
           <w:bCs/>
@@ -3381,7 +3306,6 @@
         <w:t>(</w:t>
       </w:r>
       <w:proofErr w:type="spellStart"/>
-      <w:proofErr w:type="gramEnd"/>
       <w:r>
         <w:rPr>
           <w:bCs/>
@@ -3499,7 +3423,6 @@
         <w:t xml:space="preserve">Método de consulta agregado exclusivamente para poder verificar desde las pruebas si </w:t>
       </w:r>
       <w:proofErr w:type="spellStart"/>
-      <w:proofErr w:type="gramStart"/>
       <w:r>
         <w:rPr>
           <w:lang w:val="es-MX"/>
@@ -3511,14 +3434,7 @@
         <w:rPr>
           <w:lang w:val="es-MX"/>
         </w:rPr>
-        <w:t>(</w:t>
-      </w:r>
-      <w:proofErr w:type="gramEnd"/>
-      <w:r>
-        <w:rPr>
-          <w:lang w:val="es-MX"/>
-        </w:rPr>
-        <w:t>) funcionó correctamente. Sin este método no había forma de consultar el estado de tapado desde fuera de la clase.</w:t>
+        <w:t>() funcionó correctamente. Sin este método no había forma de consultar el estado de tapado desde fuera de la clase.</w:t>
       </w:r>
     </w:p>
     <w:p>
@@ -3530,8 +3446,10 @@
       </w:pPr>
       <w:r>
         <w:rPr>
-          <w:lang w:val="es-MX"/>
-        </w:rPr>
+          <w:noProof/>
+          <w:lang w:val="es-MX"/>
+        </w:rPr>
+        <w:lastRenderedPageBreak/>
         <w:drawing>
           <wp:inline distT="0" distB="0" distL="0" distR="0" wp14:anchorId="49D863B1" wp14:editId="0D755F29">
             <wp:extent cx="5439534" cy="1638529"/>
@@ -3660,12 +3578,6 @@
         <w:gridCol w:w="1814"/>
       </w:tblGrid>
       <w:tr>
-        <w:tblPrEx>
-          <w:tblCellMar>
-            <w:top w:w="0" w:type="dxa"/>
-            <w:bottom w:w="0" w:type="dxa"/>
-          </w:tblCellMar>
-        </w:tblPrEx>
         <w:tc>
           <w:tcPr>
             <w:tcW w:w="3400" w:type="dxa"/>
@@ -3774,12 +3686,6 @@
         </w:tc>
       </w:tr>
       <w:tr>
-        <w:tblPrEx>
-          <w:tblCellMar>
-            <w:top w:w="0" w:type="dxa"/>
-            <w:bottom w:w="0" w:type="dxa"/>
-          </w:tblCellMar>
-        </w:tblPrEx>
         <w:tc>
           <w:tcPr>
             <w:tcW w:w="3400" w:type="dxa"/>
@@ -3859,34 +3765,18 @@
                 <w:lang w:val="es-MX"/>
               </w:rPr>
             </w:pPr>
-            <w:proofErr w:type="gramStart"/>
             <w:r>
               <w:rPr>
                 <w:sz w:val="19"/>
                 <w:szCs w:val="19"/>
                 <w:lang w:val="es-MX"/>
               </w:rPr>
-              <w:t>Tower(</w:t>
-            </w:r>
-            <w:proofErr w:type="gramEnd"/>
-            <w:r>
-              <w:rPr>
-                <w:sz w:val="19"/>
-                <w:szCs w:val="19"/>
-                <w:lang w:val="es-MX"/>
-              </w:rPr>
-              <w:t>4) genera altura 8 cm con anidamiento correcto</w:t>
+              <w:t>Tower(4) genera altura 8 cm con anidamiento correcto</w:t>
             </w:r>
           </w:p>
         </w:tc>
       </w:tr>
       <w:tr>
-        <w:tblPrEx>
-          <w:tblCellMar>
-            <w:top w:w="0" w:type="dxa"/>
-            <w:bottom w:w="0" w:type="dxa"/>
-          </w:tblCellMar>
-        </w:tblPrEx>
         <w:tc>
           <w:tcPr>
             <w:tcW w:w="3400" w:type="dxa"/>
@@ -3961,21 +3851,12 @@
             </w:tcMar>
           </w:tcPr>
           <w:p>
-            <w:proofErr w:type="gramStart"/>
-            <w:r>
-              <w:rPr>
-                <w:sz w:val="19"/>
-                <w:szCs w:val="19"/>
-              </w:rPr>
-              <w:t>Tower(</w:t>
-            </w:r>
-            <w:proofErr w:type="gramEnd"/>
-            <w:r>
-              <w:rPr>
-                <w:sz w:val="19"/>
-                <w:szCs w:val="19"/>
-              </w:rPr>
-              <w:t xml:space="preserve">1) no </w:t>
+            <w:r>
+              <w:rPr>
+                <w:sz w:val="19"/>
+                <w:szCs w:val="19"/>
+              </w:rPr>
+              <w:t xml:space="preserve">Tower(1) no </w:t>
             </w:r>
             <w:proofErr w:type="spellStart"/>
             <w:r>
@@ -3997,12 +3878,6 @@
         </w:tc>
       </w:tr>
       <w:tr>
-        <w:tblPrEx>
-          <w:tblCellMar>
-            <w:top w:w="0" w:type="dxa"/>
-            <w:bottom w:w="0" w:type="dxa"/>
-          </w:tblCellMar>
-        </w:tblPrEx>
         <w:tc>
           <w:tcPr>
             <w:tcW w:w="3400" w:type="dxa"/>
@@ -4082,34 +3957,18 @@
                 <w:lang w:val="es-MX"/>
               </w:rPr>
             </w:pPr>
-            <w:proofErr w:type="gramStart"/>
             <w:r>
               <w:rPr>
                 <w:sz w:val="19"/>
                 <w:szCs w:val="19"/>
                 <w:lang w:val="es-MX"/>
               </w:rPr>
-              <w:t>Tower(</w:t>
-            </w:r>
-            <w:proofErr w:type="gramEnd"/>
-            <w:r>
-              <w:rPr>
-                <w:sz w:val="19"/>
-                <w:szCs w:val="19"/>
-                <w:lang w:val="es-MX"/>
-              </w:rPr>
-              <w:t>1) crea exactamente 1 taza con índice 1</w:t>
+              <w:t>Tower(1) crea exactamente 1 taza con índice 1</w:t>
             </w:r>
           </w:p>
         </w:tc>
       </w:tr>
       <w:tr>
-        <w:tblPrEx>
-          <w:tblCellMar>
-            <w:top w:w="0" w:type="dxa"/>
-            <w:bottom w:w="0" w:type="dxa"/>
-          </w:tblCellMar>
-        </w:tblPrEx>
         <w:tc>
           <w:tcPr>
             <w:tcW w:w="3400" w:type="dxa"/>
@@ -4211,12 +4070,6 @@
         </w:tc>
       </w:tr>
       <w:tr>
-        <w:tblPrEx>
-          <w:tblCellMar>
-            <w:top w:w="0" w:type="dxa"/>
-            <w:bottom w:w="0" w:type="dxa"/>
-          </w:tblCellMar>
-        </w:tblPrEx>
         <w:tc>
           <w:tcPr>
             <w:tcW w:w="3400" w:type="dxa"/>
@@ -4297,7 +4150,6 @@
               </w:rPr>
             </w:pPr>
             <w:proofErr w:type="spellStart"/>
-            <w:proofErr w:type="gramStart"/>
             <w:r>
               <w:rPr>
                 <w:sz w:val="19"/>
@@ -4313,27 +4165,12 @@
                 <w:szCs w:val="19"/>
                 <w:lang w:val="es-MX"/>
               </w:rPr>
-              <w:t>(</w:t>
-            </w:r>
-            <w:proofErr w:type="gramEnd"/>
-            <w:r>
-              <w:rPr>
-                <w:sz w:val="19"/>
-                <w:szCs w:val="19"/>
-                <w:lang w:val="es-MX"/>
-              </w:rPr>
-              <w:t>) refleja el nuevo orden después del swap</w:t>
+              <w:t>() refleja el nuevo orden después del swap</w:t>
             </w:r>
           </w:p>
         </w:tc>
       </w:tr>
       <w:tr>
-        <w:tblPrEx>
-          <w:tblCellMar>
-            <w:top w:w="0" w:type="dxa"/>
-            <w:bottom w:w="0" w:type="dxa"/>
-          </w:tblCellMar>
-        </w:tblPrEx>
         <w:tc>
           <w:tcPr>
             <w:tcW w:w="3400" w:type="dxa"/>
@@ -4425,12 +4262,6 @@
         </w:tc>
       </w:tr>
       <w:tr>
-        <w:tblPrEx>
-          <w:tblCellMar>
-            <w:top w:w="0" w:type="dxa"/>
-            <w:bottom w:w="0" w:type="dxa"/>
-          </w:tblCellMar>
-        </w:tblPrEx>
         <w:tc>
           <w:tcPr>
             <w:tcW w:w="3400" w:type="dxa"/>
@@ -4522,12 +4353,6 @@
         </w:tc>
       </w:tr>
       <w:tr>
-        <w:tblPrEx>
-          <w:tblCellMar>
-            <w:top w:w="0" w:type="dxa"/>
-            <w:bottom w:w="0" w:type="dxa"/>
-          </w:tblCellMar>
-        </w:tblPrEx>
         <w:tc>
           <w:tcPr>
             <w:tcW w:w="3400" w:type="dxa"/>
@@ -4619,12 +4444,6 @@
         </w:tc>
       </w:tr>
       <w:tr>
-        <w:tblPrEx>
-          <w:tblCellMar>
-            <w:top w:w="0" w:type="dxa"/>
-            <w:bottom w:w="0" w:type="dxa"/>
-          </w:tblCellMar>
-        </w:tblPrEx>
         <w:tc>
           <w:tcPr>
             <w:tcW w:w="3400" w:type="dxa"/>
@@ -4716,12 +4535,6 @@
         </w:tc>
       </w:tr>
       <w:tr>
-        <w:tblPrEx>
-          <w:tblCellMar>
-            <w:top w:w="0" w:type="dxa"/>
-            <w:bottom w:w="0" w:type="dxa"/>
-          </w:tblCellMar>
-        </w:tblPrEx>
         <w:tc>
           <w:tcPr>
             <w:tcW w:w="3400" w:type="dxa"/>
@@ -4746,6 +4559,7 @@
                 <w:sz w:val="19"/>
                 <w:szCs w:val="19"/>
               </w:rPr>
+              <w:lastRenderedPageBreak/>
               <w:t>accordingBAShould_ReturnFalseForNonExistentCupInCovered</w:t>
             </w:r>
             <w:proofErr w:type="spellEnd"/>
@@ -4823,12 +4637,6 @@
         </w:tc>
       </w:tr>
       <w:tr>
-        <w:tblPrEx>
-          <w:tblCellMar>
-            <w:top w:w="0" w:type="dxa"/>
-            <w:bottom w:w="0" w:type="dxa"/>
-          </w:tblCellMar>
-        </w:tblPrEx>
         <w:tc>
           <w:tcPr>
             <w:tcW w:w="3400" w:type="dxa"/>
@@ -4955,12 +4763,6 @@
         </w:tc>
       </w:tr>
       <w:tr>
-        <w:tblPrEx>
-          <w:tblCellMar>
-            <w:top w:w="0" w:type="dxa"/>
-            <w:bottom w:w="0" w:type="dxa"/>
-          </w:tblCellMar>
-        </w:tblPrEx>
         <w:tc>
           <w:tcPr>
             <w:tcW w:w="3400" w:type="dxa"/>
@@ -5071,12 +4873,6 @@
         </w:tc>
       </w:tr>
       <w:tr>
-        <w:tblPrEx>
-          <w:tblCellMar>
-            <w:top w:w="0" w:type="dxa"/>
-            <w:bottom w:w="0" w:type="dxa"/>
-          </w:tblCellMar>
-        </w:tblPrEx>
         <w:tc>
           <w:tcPr>
             <w:tcW w:w="3400" w:type="dxa"/>
@@ -5195,12 +4991,6 @@
         </w:tc>
       </w:tr>
       <w:tr>
-        <w:tblPrEx>
-          <w:tblCellMar>
-            <w:top w:w="0" w:type="dxa"/>
-            <w:bottom w:w="0" w:type="dxa"/>
-          </w:tblCellMar>
-        </w:tblPrEx>
         <w:tc>
           <w:tcPr>
             <w:tcW w:w="3400" w:type="dxa"/>
@@ -5328,12 +5118,6 @@
         </w:tc>
       </w:tr>
       <w:tr>
-        <w:tblPrEx>
-          <w:tblCellMar>
-            <w:top w:w="0" w:type="dxa"/>
-            <w:bottom w:w="0" w:type="dxa"/>
-          </w:tblCellMar>
-        </w:tblPrEx>
         <w:tc>
           <w:tcPr>
             <w:tcW w:w="3400" w:type="dxa"/>
@@ -5515,12 +5299,6 @@
         <w:gridCol w:w="2000"/>
       </w:tblGrid>
       <w:tr>
-        <w:tblPrEx>
-          <w:tblCellMar>
-            <w:top w:w="0" w:type="dxa"/>
-            <w:bottom w:w="0" w:type="dxa"/>
-          </w:tblCellMar>
-        </w:tblPrEx>
         <w:tc>
           <w:tcPr>
             <w:tcW w:w="3500" w:type="dxa"/>
@@ -5611,12 +5389,6 @@
         </w:tc>
       </w:tr>
       <w:tr>
-        <w:tblPrEx>
-          <w:tblCellMar>
-            <w:top w:w="0" w:type="dxa"/>
-            <w:bottom w:w="0" w:type="dxa"/>
-          </w:tblCellMar>
-        </w:tblPrEx>
         <w:tc>
           <w:tcPr>
             <w:tcW w:w="3500" w:type="dxa"/>
@@ -5709,18 +5481,12 @@
                 <w:sz w:val="19"/>
                 <w:szCs w:val="19"/>
               </w:rPr>
-              <w:t>✅ Listo</w:t>
+              <w:t xml:space="preserve"> Listo</w:t>
             </w:r>
           </w:p>
         </w:tc>
       </w:tr>
       <w:tr>
-        <w:tblPrEx>
-          <w:tblCellMar>
-            <w:top w:w="0" w:type="dxa"/>
-            <w:bottom w:w="0" w:type="dxa"/>
-          </w:tblCellMar>
-        </w:tblPrEx>
         <w:tc>
           <w:tcPr>
             <w:tcW w:w="3500" w:type="dxa"/>
@@ -5806,18 +5572,12 @@
                 <w:sz w:val="19"/>
                 <w:szCs w:val="19"/>
               </w:rPr>
-              <w:t>✅ Listo</w:t>
+              <w:t xml:space="preserve"> Listo</w:t>
             </w:r>
           </w:p>
         </w:tc>
       </w:tr>
       <w:tr>
-        <w:tblPrEx>
-          <w:tblCellMar>
-            <w:top w:w="0" w:type="dxa"/>
-            <w:bottom w:w="0" w:type="dxa"/>
-          </w:tblCellMar>
-        </w:tblPrEx>
         <w:tc>
           <w:tcPr>
             <w:tcW w:w="3500" w:type="dxa"/>
@@ -5936,18 +5696,12 @@
                 <w:sz w:val="19"/>
                 <w:szCs w:val="19"/>
               </w:rPr>
-              <w:t>✅ Listo</w:t>
+              <w:t xml:space="preserve"> Listo</w:t>
             </w:r>
           </w:p>
         </w:tc>
       </w:tr>
       <w:tr>
-        <w:tblPrEx>
-          <w:tblCellMar>
-            <w:top w:w="0" w:type="dxa"/>
-            <w:bottom w:w="0" w:type="dxa"/>
-          </w:tblCellMar>
-        </w:tblPrEx>
         <w:tc>
           <w:tcPr>
             <w:tcW w:w="3500" w:type="dxa"/>
@@ -6031,18 +5785,12 @@
                 <w:sz w:val="19"/>
                 <w:szCs w:val="19"/>
               </w:rPr>
-              <w:t>✅ Listo</w:t>
+              <w:t xml:space="preserve"> Listo</w:t>
             </w:r>
           </w:p>
         </w:tc>
       </w:tr>
       <w:tr>
-        <w:tblPrEx>
-          <w:tblCellMar>
-            <w:top w:w="0" w:type="dxa"/>
-            <w:bottom w:w="0" w:type="dxa"/>
-          </w:tblCellMar>
-        </w:tblPrEx>
         <w:tc>
           <w:tcPr>
             <w:tcW w:w="3500" w:type="dxa"/>
@@ -6154,18 +5902,12 @@
                 <w:sz w:val="19"/>
                 <w:szCs w:val="19"/>
               </w:rPr>
-              <w:t>✅ Listo</w:t>
+              <w:t xml:space="preserve"> Listo</w:t>
             </w:r>
           </w:p>
         </w:tc>
       </w:tr>
       <w:tr>
-        <w:tblPrEx>
-          <w:tblCellMar>
-            <w:top w:w="0" w:type="dxa"/>
-            <w:bottom w:w="0" w:type="dxa"/>
-          </w:tblCellMar>
-        </w:tblPrEx>
         <w:tc>
           <w:tcPr>
             <w:tcW w:w="3500" w:type="dxa"/>
@@ -6284,18 +6026,12 @@
                 <w:sz w:val="19"/>
                 <w:szCs w:val="19"/>
               </w:rPr>
-              <w:t>⬜ Pendiente</w:t>
+              <w:t xml:space="preserve"> Pendiente</w:t>
             </w:r>
           </w:p>
         </w:tc>
       </w:tr>
       <w:tr>
-        <w:tblPrEx>
-          <w:tblCellMar>
-            <w:top w:w="0" w:type="dxa"/>
-            <w:bottom w:w="0" w:type="dxa"/>
-          </w:tblCellMar>
-        </w:tblPrEx>
         <w:tc>
           <w:tcPr>
             <w:tcW w:w="3500" w:type="dxa"/>
@@ -6400,7 +6136,7 @@
                 <w:sz w:val="19"/>
                 <w:szCs w:val="19"/>
               </w:rPr>
-              <w:t>⬜ Pendiente</w:t>
+              <w:t xml:space="preserve"> Pendiente</w:t>
             </w:r>
           </w:p>
         </w:tc>

</xml_diff>